<commit_message>
feat: ngrok tunnel implementation with launcher
</commit_message>
<xml_diff>
--- a/firebase 구축.docx
+++ b/firebase 구축.docx
@@ -13,17 +13,17 @@
           <w:i w:val="0"/>
           <w:b w:val="0"/>
           <w:color w:val="auto"/>
-          <w:shd w:val="clear"/>
-          <w:rFonts w:ascii="Segoe UI" w:eastAsia="Segoe WPC" w:hAnsi="Segoe UI" w:cs="Segoe WPC"/>
-        </w:rPr>
-      </w:pPr>
-      <w:r>
-        <w:rPr>
-          <w:spacing w:val="0"/>
-          <w:i w:val="0"/>
-          <w:b w:val="0"/>
-          <w:color w:val="auto"/>
-          <w:shd w:val="clear"/>
+          <w:shd w:val="clear" w:color="auto" w:fill="auto"/>
+          <w:rFonts w:ascii="Segoe UI" w:eastAsia="Segoe WPC" w:hAnsi="Segoe UI" w:cs="Segoe WPC"/>
+        </w:rPr>
+      </w:pPr>
+      <w:r>
+        <w:rPr>
+          <w:spacing w:val="0"/>
+          <w:i w:val="0"/>
+          <w:b w:val="0"/>
+          <w:color w:val="auto"/>
+          <w:shd w:val="clear" w:color="auto" w:fill="auto"/>
           <w:rFonts w:ascii="Segoe UI" w:eastAsia="Segoe WPC" w:hAnsi="Segoe UI" w:cs="Segoe WPC"/>
         </w:rPr>
         <w:t xml:space="preserve">Firebase 웹서비스 구현이 완료되었습니다! </w:t>
@@ -34,7 +34,7 @@
           <w:i w:val="0"/>
           <w:b w:val="0"/>
           <w:color w:val="auto"/>
-          <w:shd w:val="clear"/>
+          <w:shd w:val="clear" w:color="auto" w:fill="auto"/>
           <w:rFonts w:ascii="Segoe UI" w:eastAsia="Segoe WPC" w:hAnsi="Segoe UI" w:cs="Segoe WPC"/>
         </w:rPr>
         <w:t>🎉</w:t>
@@ -51,17 +51,17 @@
           <w:i w:val="0"/>
           <w:b w:val="0"/>
           <w:color w:val="auto"/>
-          <w:shd w:val="clear"/>
-          <w:rFonts w:ascii="Segoe UI" w:eastAsia="Segoe WPC" w:hAnsi="Segoe UI" w:cs="Segoe WPC"/>
-        </w:rPr>
-      </w:pPr>
-      <w:r>
-        <w:rPr>
-          <w:spacing w:val="0"/>
-          <w:i w:val="0"/>
-          <w:b w:val="0"/>
-          <w:color w:val="auto"/>
-          <w:shd w:val="clear"/>
+          <w:shd w:val="clear" w:color="auto" w:fill="auto"/>
+          <w:rFonts w:ascii="Segoe UI" w:eastAsia="Segoe WPC" w:hAnsi="Segoe UI" w:cs="Segoe WPC"/>
+        </w:rPr>
+      </w:pPr>
+      <w:r>
+        <w:rPr>
+          <w:spacing w:val="0"/>
+          <w:i w:val="0"/>
+          <w:b w:val="0"/>
+          <w:color w:val="auto"/>
+          <w:shd w:val="clear" w:color="auto" w:fill="auto"/>
           <w:rFonts w:ascii="Segoe UI" w:eastAsia="Segoe WPC" w:hAnsi="Segoe UI" w:cs="Segoe WPC"/>
         </w:rPr>
         <w:t xml:space="preserve">생성된 파일들:</w:t>
@@ -80,19 +80,19 @@
           <w:color w:val="auto"/>
           <w:sz w:val="21"/>
           <w:szCs w:val="21"/>
-          <w:shd w:val="clear"/>
-          <w:rFonts w:ascii="Segoe UI" w:eastAsia="Segoe WPC" w:hAnsi="Segoe UI" w:cs="Segoe WPC"/>
-        </w:rPr>
-      </w:pPr>
-      <w:r>
-        <w:rPr>
-          <w:spacing w:val="0"/>
-          <w:i w:val="0"/>
-          <w:b w:val="0"/>
-          <w:color w:val="auto"/>
-          <w:sz w:val="21"/>
-          <w:szCs w:val="21"/>
-          <w:shd w:val="clear"/>
+          <w:shd w:val="clear" w:color="auto" w:fill="auto"/>
+          <w:rFonts w:ascii="Segoe UI" w:eastAsia="Segoe WPC" w:hAnsi="Segoe UI" w:cs="Segoe WPC"/>
+        </w:rPr>
+      </w:pPr>
+      <w:r>
+        <w:rPr>
+          <w:spacing w:val="0"/>
+          <w:i w:val="0"/>
+          <w:b w:val="0"/>
+          <w:color w:val="auto"/>
+          <w:sz w:val="21"/>
+          <w:szCs w:val="21"/>
+          <w:shd w:val="clear" w:color="auto" w:fill="auto"/>
           <w:rFonts w:ascii="Segoe UI" w:eastAsia="Segoe WPC" w:hAnsi="Segoe UI" w:cs="Segoe WPC"/>
         </w:rPr>
         <w:t xml:space="preserve">Backend: </w:t>
@@ -110,19 +110,19 @@
           <w:color w:val="auto"/>
           <w:sz w:val="21"/>
           <w:szCs w:val="21"/>
-          <w:shd w:val="clear"/>
-          <w:rFonts w:ascii="Courier" w:eastAsia="SF Mono" w:hAnsi="Courier" w:cs="SF Mono"/>
-        </w:rPr>
-      </w:pPr>
-      <w:r>
-        <w:rPr>
-          <w:spacing w:val="0"/>
-          <w:i w:val="0"/>
-          <w:b w:val="0"/>
-          <w:color w:val="auto"/>
-          <w:sz w:val="21"/>
-          <w:szCs w:val="21"/>
-          <w:shd w:val="clear"/>
+          <w:shd w:val="clear" w:color="auto" w:fill="auto"/>
+          <w:rFonts w:ascii="Courier" w:eastAsia="SF Mono" w:hAnsi="Courier" w:cs="SF Mono"/>
+        </w:rPr>
+      </w:pPr>
+      <w:r>
+        <w:rPr>
+          <w:spacing w:val="0"/>
+          <w:i w:val="0"/>
+          <w:b w:val="0"/>
+          <w:color w:val="auto"/>
+          <w:sz w:val="21"/>
+          <w:szCs w:val="21"/>
+          <w:shd w:val="clear" w:color="auto" w:fill="auto"/>
           <w:rFonts w:ascii="Courier" w:eastAsia="SF Mono" w:hAnsi="Courier" w:cs="SF Mono"/>
         </w:rPr>
         <w:t>functions/index.js</w:t>
@@ -135,7 +135,7 @@
           <w:color w:val="auto"/>
           <w:sz w:val="21"/>
           <w:szCs w:val="21"/>
-          <w:shd w:val="clear"/>
+          <w:shd w:val="clear" w:color="auto" w:fill="auto"/>
           <w:rFonts w:ascii="Segoe UI" w:eastAsia="Segoe WPC" w:hAnsi="Segoe UI" w:cs="Segoe WPC"/>
         </w:rPr>
         <w:t xml:space="preserve">, </w:t>
@@ -148,7 +148,7 @@
           <w:color w:val="auto"/>
           <w:sz w:val="21"/>
           <w:szCs w:val="21"/>
-          <w:shd w:val="clear"/>
+          <w:shd w:val="clear" w:color="auto" w:fill="auto"/>
           <w:rFonts w:ascii="Courier" w:eastAsia="SF Mono" w:hAnsi="Courier" w:cs="SF Mono"/>
         </w:rPr>
         <w:t>functions/package.json</w:t>
@@ -167,19 +167,19 @@
           <w:color w:val="auto"/>
           <w:sz w:val="21"/>
           <w:szCs w:val="21"/>
-          <w:shd w:val="clear"/>
-          <w:rFonts w:ascii="Segoe UI" w:eastAsia="Segoe WPC" w:hAnsi="Segoe UI" w:cs="Segoe WPC"/>
-        </w:rPr>
-      </w:pPr>
-      <w:r>
-        <w:rPr>
-          <w:spacing w:val="0"/>
-          <w:i w:val="0"/>
-          <w:b w:val="0"/>
-          <w:color w:val="auto"/>
-          <w:sz w:val="21"/>
-          <w:szCs w:val="21"/>
-          <w:shd w:val="clear"/>
+          <w:shd w:val="clear" w:color="auto" w:fill="auto"/>
+          <w:rFonts w:ascii="Segoe UI" w:eastAsia="Segoe WPC" w:hAnsi="Segoe UI" w:cs="Segoe WPC"/>
+        </w:rPr>
+      </w:pPr>
+      <w:r>
+        <w:rPr>
+          <w:spacing w:val="0"/>
+          <w:i w:val="0"/>
+          <w:b w:val="0"/>
+          <w:color w:val="auto"/>
+          <w:sz w:val="21"/>
+          <w:szCs w:val="21"/>
+          <w:shd w:val="clear" w:color="auto" w:fill="auto"/>
           <w:rFonts w:ascii="Segoe UI" w:eastAsia="Segoe WPC" w:hAnsi="Segoe UI" w:cs="Segoe WPC"/>
         </w:rPr>
         <w:t xml:space="preserve">Frontend: </w:t>
@@ -197,19 +197,19 @@
           <w:color w:val="auto"/>
           <w:sz w:val="21"/>
           <w:szCs w:val="21"/>
-          <w:shd w:val="clear"/>
-          <w:rFonts w:ascii="Courier" w:eastAsia="SF Mono" w:hAnsi="Courier" w:cs="SF Mono"/>
-        </w:rPr>
-      </w:pPr>
-      <w:r>
-        <w:rPr>
-          <w:spacing w:val="0"/>
-          <w:i w:val="0"/>
-          <w:b w:val="0"/>
-          <w:color w:val="auto"/>
-          <w:sz w:val="21"/>
-          <w:szCs w:val="21"/>
-          <w:shd w:val="clear"/>
+          <w:shd w:val="clear" w:color="auto" w:fill="auto"/>
+          <w:rFonts w:ascii="Courier" w:eastAsia="SF Mono" w:hAnsi="Courier" w:cs="SF Mono"/>
+        </w:rPr>
+      </w:pPr>
+      <w:r>
+        <w:rPr>
+          <w:spacing w:val="0"/>
+          <w:i w:val="0"/>
+          <w:b w:val="0"/>
+          <w:color w:val="auto"/>
+          <w:sz w:val="21"/>
+          <w:szCs w:val="21"/>
+          <w:shd w:val="clear" w:color="auto" w:fill="auto"/>
           <w:rFonts w:ascii="Courier" w:eastAsia="SF Mono" w:hAnsi="Courier" w:cs="SF Mono"/>
         </w:rPr>
         <w:t>public/index.html</w:t>
@@ -222,7 +222,7 @@
           <w:color w:val="auto"/>
           <w:sz w:val="21"/>
           <w:szCs w:val="21"/>
-          <w:shd w:val="clear"/>
+          <w:shd w:val="clear" w:color="auto" w:fill="auto"/>
           <w:rFonts w:ascii="Segoe UI" w:eastAsia="Segoe WPC" w:hAnsi="Segoe UI" w:cs="Segoe WPC"/>
         </w:rPr>
         <w:t xml:space="preserve">, </w:t>
@@ -235,7 +235,7 @@
           <w:color w:val="auto"/>
           <w:sz w:val="21"/>
           <w:szCs w:val="21"/>
-          <w:shd w:val="clear"/>
+          <w:shd w:val="clear" w:color="auto" w:fill="auto"/>
           <w:rFonts w:ascii="Courier" w:eastAsia="SF Mono" w:hAnsi="Courier" w:cs="SF Mono"/>
         </w:rPr>
         <w:t>public/style.css</w:t>
@@ -248,7 +248,7 @@
           <w:color w:val="auto"/>
           <w:sz w:val="21"/>
           <w:szCs w:val="21"/>
-          <w:shd w:val="clear"/>
+          <w:shd w:val="clear" w:color="auto" w:fill="auto"/>
           <w:rFonts w:ascii="Segoe UI" w:eastAsia="Segoe WPC" w:hAnsi="Segoe UI" w:cs="Segoe WPC"/>
         </w:rPr>
         <w:t xml:space="preserve">, </w:t>
@@ -261,7 +261,7 @@
           <w:color w:val="auto"/>
           <w:sz w:val="21"/>
           <w:szCs w:val="21"/>
-          <w:shd w:val="clear"/>
+          <w:shd w:val="clear" w:color="auto" w:fill="auto"/>
           <w:rFonts w:ascii="Courier" w:eastAsia="SF Mono" w:hAnsi="Courier" w:cs="SF Mono"/>
         </w:rPr>
         <w:t>public/app.js</w:t>
@@ -280,19 +280,19 @@
           <w:color w:val="auto"/>
           <w:sz w:val="21"/>
           <w:szCs w:val="21"/>
-          <w:shd w:val="clear"/>
-          <w:rFonts w:ascii="Segoe UI" w:eastAsia="Segoe WPC" w:hAnsi="Segoe UI" w:cs="Segoe WPC"/>
-        </w:rPr>
-      </w:pPr>
-      <w:r>
-        <w:rPr>
-          <w:spacing w:val="0"/>
-          <w:i w:val="0"/>
-          <w:b w:val="0"/>
-          <w:color w:val="auto"/>
-          <w:sz w:val="21"/>
-          <w:szCs w:val="21"/>
-          <w:shd w:val="clear"/>
+          <w:shd w:val="clear" w:color="auto" w:fill="auto"/>
+          <w:rFonts w:ascii="Segoe UI" w:eastAsia="Segoe WPC" w:hAnsi="Segoe UI" w:cs="Segoe WPC"/>
+        </w:rPr>
+      </w:pPr>
+      <w:r>
+        <w:rPr>
+          <w:spacing w:val="0"/>
+          <w:i w:val="0"/>
+          <w:b w:val="0"/>
+          <w:color w:val="auto"/>
+          <w:sz w:val="21"/>
+          <w:szCs w:val="21"/>
+          <w:shd w:val="clear" w:color="auto" w:fill="auto"/>
           <w:rFonts w:ascii="Segoe UI" w:eastAsia="Segoe WPC" w:hAnsi="Segoe UI" w:cs="Segoe WPC"/>
         </w:rPr>
         <w:t xml:space="preserve">설정: </w:t>
@@ -310,19 +310,19 @@
           <w:color w:val="auto"/>
           <w:sz w:val="21"/>
           <w:szCs w:val="21"/>
-          <w:shd w:val="clear"/>
-          <w:rFonts w:ascii="Courier" w:eastAsia="SF Mono" w:hAnsi="Courier" w:cs="SF Mono"/>
-        </w:rPr>
-      </w:pPr>
-      <w:r>
-        <w:rPr>
-          <w:spacing w:val="0"/>
-          <w:i w:val="0"/>
-          <w:b w:val="0"/>
-          <w:color w:val="auto"/>
-          <w:sz w:val="21"/>
-          <w:szCs w:val="21"/>
-          <w:shd w:val="clear"/>
+          <w:shd w:val="clear" w:color="auto" w:fill="auto"/>
+          <w:rFonts w:ascii="Courier" w:eastAsia="SF Mono" w:hAnsi="Courier" w:cs="SF Mono"/>
+        </w:rPr>
+      </w:pPr>
+      <w:r>
+        <w:rPr>
+          <w:spacing w:val="0"/>
+          <w:i w:val="0"/>
+          <w:b w:val="0"/>
+          <w:color w:val="auto"/>
+          <w:sz w:val="21"/>
+          <w:szCs w:val="21"/>
+          <w:shd w:val="clear" w:color="auto" w:fill="auto"/>
           <w:rFonts w:ascii="Courier" w:eastAsia="SF Mono" w:hAnsi="Courier" w:cs="SF Mono"/>
         </w:rPr>
         <w:t>firebase.json</w:t>
@@ -335,7 +335,7 @@
           <w:color w:val="auto"/>
           <w:sz w:val="21"/>
           <w:szCs w:val="21"/>
-          <w:shd w:val="clear"/>
+          <w:shd w:val="clear" w:color="auto" w:fill="auto"/>
           <w:rFonts w:ascii="Segoe UI" w:eastAsia="Segoe WPC" w:hAnsi="Segoe UI" w:cs="Segoe WPC"/>
         </w:rPr>
         <w:t xml:space="preserve">, </w:t>
@@ -348,7 +348,7 @@
           <w:color w:val="auto"/>
           <w:sz w:val="21"/>
           <w:szCs w:val="21"/>
-          <w:shd w:val="clear"/>
+          <w:shd w:val="clear" w:color="auto" w:fill="auto"/>
           <w:rFonts w:ascii="Courier" w:eastAsia="SF Mono" w:hAnsi="Courier" w:cs="SF Mono"/>
         </w:rPr>
         <w:t>.firebaserc</w:t>
@@ -361,7 +361,7 @@
           <w:color w:val="auto"/>
           <w:sz w:val="21"/>
           <w:szCs w:val="21"/>
-          <w:shd w:val="clear"/>
+          <w:shd w:val="clear" w:color="auto" w:fill="auto"/>
           <w:rFonts w:ascii="Segoe UI" w:eastAsia="Segoe WPC" w:hAnsi="Segoe UI" w:cs="Segoe WPC"/>
         </w:rPr>
         <w:t xml:space="preserve">, </w:t>
@@ -374,7 +374,7 @@
           <w:color w:val="auto"/>
           <w:sz w:val="21"/>
           <w:szCs w:val="21"/>
-          <w:shd w:val="clear"/>
+          <w:shd w:val="clear" w:color="auto" w:fill="auto"/>
           <w:rFonts w:ascii="Courier" w:eastAsia="SF Mono" w:hAnsi="Courier" w:cs="SF Mono"/>
         </w:rPr>
         <w:t>.gitignore</w:t>
@@ -393,19 +393,19 @@
           <w:color w:val="auto"/>
           <w:sz w:val="21"/>
           <w:szCs w:val="21"/>
-          <w:shd w:val="clear"/>
-          <w:rFonts w:ascii="Segoe UI" w:eastAsia="Segoe WPC" w:hAnsi="Segoe UI" w:cs="Segoe WPC"/>
-        </w:rPr>
-      </w:pPr>
-      <w:r>
-        <w:rPr>
-          <w:spacing w:val="0"/>
-          <w:i w:val="0"/>
-          <w:b w:val="0"/>
-          <w:color w:val="auto"/>
-          <w:sz w:val="21"/>
-          <w:szCs w:val="21"/>
-          <w:shd w:val="clear"/>
+          <w:shd w:val="clear" w:color="auto" w:fill="auto"/>
+          <w:rFonts w:ascii="Segoe UI" w:eastAsia="Segoe WPC" w:hAnsi="Segoe UI" w:cs="Segoe WPC"/>
+        </w:rPr>
+      </w:pPr>
+      <w:r>
+        <w:rPr>
+          <w:spacing w:val="0"/>
+          <w:i w:val="0"/>
+          <w:b w:val="0"/>
+          <w:color w:val="auto"/>
+          <w:sz w:val="21"/>
+          <w:szCs w:val="21"/>
+          <w:shd w:val="clear" w:color="auto" w:fill="auto"/>
           <w:rFonts w:ascii="Segoe UI" w:eastAsia="Segoe WPC" w:hAnsi="Segoe UI" w:cs="Segoe WPC"/>
         </w:rPr>
         <w:t xml:space="preserve">문서: </w:t>
@@ -423,7 +423,7 @@
           <w:color w:val="auto"/>
           <w:sz w:val="21"/>
           <w:szCs w:val="21"/>
-          <w:shd w:val="clear"/>
+          <w:shd w:val="clear" w:color="auto" w:fill="auto"/>
           <w:rFonts w:ascii="Courier" w:eastAsia="SF Mono" w:hAnsi="Courier" w:cs="SF Mono"/>
           <w:lang w:eastAsia="ko-KR"/>
         </w:rPr>
@@ -436,7 +436,7 @@
           <w:color w:val="auto"/>
           <w:sz w:val="21"/>
           <w:szCs w:val="21"/>
-          <w:shd w:val="clear"/>
+          <w:shd w:val="clear" w:color="auto" w:fill="auto"/>
           <w:rFonts w:ascii="Courier" w:eastAsia="SF Mono" w:hAnsi="Courier" w:cs="SF Mono"/>
         </w:rPr>
         <w:t>README.md</w:t>
@@ -454,7 +454,7 @@
           <w:color w:val="auto"/>
           <w:sz w:val="21"/>
           <w:szCs w:val="21"/>
-          <w:shd w:val="clear"/>
+          <w:shd w:val="clear" w:color="auto" w:fill="auto"/>
           <w:rFonts w:ascii="Courier" w:eastAsia="SF Mono" w:hAnsi="Courier" w:cs="SF Mono"/>
         </w:rPr>
       </w:pPr>
@@ -470,17 +470,17 @@
           <w:i w:val="0"/>
           <w:b w:val="0"/>
           <w:color w:val="auto"/>
-          <w:shd w:val="clear"/>
-          <w:rFonts w:ascii="Segoe UI" w:eastAsia="Segoe WPC" w:hAnsi="Segoe UI" w:cs="Segoe WPC"/>
-        </w:rPr>
-      </w:pPr>
-      <w:r>
-        <w:rPr>
-          <w:spacing w:val="0"/>
-          <w:i w:val="0"/>
-          <w:b w:val="0"/>
-          <w:color w:val="auto"/>
-          <w:shd w:val="clear"/>
+          <w:shd w:val="clear" w:color="auto" w:fill="auto"/>
+          <w:rFonts w:ascii="Segoe UI" w:eastAsia="Segoe WPC" w:hAnsi="Segoe UI" w:cs="Segoe WPC"/>
+        </w:rPr>
+      </w:pPr>
+      <w:r>
+        <w:rPr>
+          <w:spacing w:val="0"/>
+          <w:i w:val="0"/>
+          <w:b w:val="0"/>
+          <w:color w:val="auto"/>
+          <w:shd w:val="clear" w:color="auto" w:fill="auto"/>
           <w:rFonts w:ascii="Segoe UI" w:eastAsia="Segoe WPC" w:hAnsi="Segoe UI" w:cs="Segoe WPC"/>
         </w:rPr>
         <w:t xml:space="preserve">다음 단계:</w:t>
@@ -499,19 +499,19 @@
           <w:color w:val="auto"/>
           <w:sz w:val="21"/>
           <w:szCs w:val="21"/>
-          <w:shd w:val="clear"/>
-          <w:rFonts w:ascii="Segoe UI" w:eastAsia="Segoe WPC" w:hAnsi="Segoe UI" w:cs="Segoe WPC"/>
-        </w:rPr>
-      </w:pPr>
-      <w:r>
-        <w:rPr>
-          <w:spacing w:val="0"/>
-          <w:i w:val="0"/>
-          <w:b w:val="0"/>
-          <w:color w:val="auto"/>
-          <w:sz w:val="21"/>
-          <w:szCs w:val="21"/>
-          <w:shd w:val="clear"/>
+          <w:shd w:val="clear" w:color="auto" w:fill="auto"/>
+          <w:rFonts w:ascii="Segoe UI" w:eastAsia="Segoe WPC" w:hAnsi="Segoe UI" w:cs="Segoe WPC"/>
+        </w:rPr>
+      </w:pPr>
+      <w:r>
+        <w:rPr>
+          <w:spacing w:val="0"/>
+          <w:i w:val="0"/>
+          <w:b w:val="0"/>
+          <w:color w:val="auto"/>
+          <w:sz w:val="21"/>
+          <w:szCs w:val="21"/>
+          <w:shd w:val="clear" w:color="auto" w:fill="auto"/>
           <w:rFonts w:ascii="Segoe UI" w:eastAsia="Segoe WPC" w:hAnsi="Segoe UI" w:cs="Segoe WPC"/>
         </w:rPr>
         <w:t xml:space="preserve">Firebase Console에서 프로젝트 생성</w:t>
@@ -530,19 +530,19 @@
           <w:color w:val="auto"/>
           <w:sz w:val="21"/>
           <w:szCs w:val="21"/>
-          <w:shd w:val="clear"/>
-          <w:rFonts w:ascii="Courier" w:eastAsia="SF Mono" w:hAnsi="Courier" w:cs="SF Mono"/>
-        </w:rPr>
-      </w:pPr>
-      <w:r>
-        <w:rPr>
-          <w:spacing w:val="0"/>
-          <w:i w:val="0"/>
-          <w:b w:val="0"/>
-          <w:color w:val="auto"/>
-          <w:sz w:val="21"/>
-          <w:szCs w:val="21"/>
-          <w:shd w:val="clear"/>
+          <w:shd w:val="clear" w:color="auto" w:fill="auto"/>
+          <w:rFonts w:ascii="Courier" w:eastAsia="SF Mono" w:hAnsi="Courier" w:cs="SF Mono"/>
+        </w:rPr>
+      </w:pPr>
+      <w:r>
+        <w:rPr>
+          <w:spacing w:val="0"/>
+          <w:i w:val="0"/>
+          <w:b w:val="0"/>
+          <w:color w:val="auto"/>
+          <w:sz w:val="21"/>
+          <w:szCs w:val="21"/>
+          <w:shd w:val="clear" w:color="auto" w:fill="auto"/>
           <w:rFonts w:ascii="Courier" w:eastAsia="SF Mono" w:hAnsi="Courier" w:cs="SF Mono"/>
         </w:rPr>
         <w:t>.firebaserc</w:t>
@@ -561,19 +561,19 @@
           <w:color w:val="auto"/>
           <w:sz w:val="21"/>
           <w:szCs w:val="21"/>
-          <w:shd w:val="clear"/>
-          <w:rFonts w:ascii="Segoe UI" w:eastAsia="Segoe WPC" w:hAnsi="Segoe UI" w:cs="Segoe WPC"/>
-        </w:rPr>
-      </w:pPr>
-      <w:r>
-        <w:rPr>
-          <w:spacing w:val="0"/>
-          <w:i w:val="0"/>
-          <w:b w:val="0"/>
-          <w:color w:val="auto"/>
-          <w:sz w:val="21"/>
-          <w:szCs w:val="21"/>
-          <w:shd w:val="clear"/>
+          <w:shd w:val="clear" w:color="auto" w:fill="auto"/>
+          <w:rFonts w:ascii="Segoe UI" w:eastAsia="Segoe WPC" w:hAnsi="Segoe UI" w:cs="Segoe WPC"/>
+        </w:rPr>
+      </w:pPr>
+      <w:r>
+        <w:rPr>
+          <w:spacing w:val="0"/>
+          <w:i w:val="0"/>
+          <w:b w:val="0"/>
+          <w:color w:val="auto"/>
+          <w:sz w:val="21"/>
+          <w:szCs w:val="21"/>
+          <w:shd w:val="clear" w:color="auto" w:fill="auto"/>
           <w:rFonts w:ascii="Segoe UI" w:eastAsia="Segoe WPC" w:hAnsi="Segoe UI" w:cs="Segoe WPC"/>
         </w:rPr>
         <w:t xml:space="preserve">와 </w:t>
@@ -591,19 +591,19 @@
           <w:color w:val="auto"/>
           <w:sz w:val="21"/>
           <w:szCs w:val="21"/>
-          <w:shd w:val="clear"/>
-          <w:rFonts w:ascii="Courier" w:eastAsia="SF Mono" w:hAnsi="Courier" w:cs="SF Mono"/>
-        </w:rPr>
-      </w:pPr>
-      <w:r>
-        <w:rPr>
-          <w:spacing w:val="0"/>
-          <w:i w:val="0"/>
-          <w:b w:val="0"/>
-          <w:color w:val="auto"/>
-          <w:sz w:val="21"/>
-          <w:szCs w:val="21"/>
-          <w:shd w:val="clear"/>
+          <w:shd w:val="clear" w:color="auto" w:fill="auto"/>
+          <w:rFonts w:ascii="Courier" w:eastAsia="SF Mono" w:hAnsi="Courier" w:cs="SF Mono"/>
+        </w:rPr>
+      </w:pPr>
+      <w:r>
+        <w:rPr>
+          <w:spacing w:val="0"/>
+          <w:i w:val="0"/>
+          <w:b w:val="0"/>
+          <w:color w:val="auto"/>
+          <w:sz w:val="21"/>
+          <w:szCs w:val="21"/>
+          <w:shd w:val="clear" w:color="auto" w:fill="auto"/>
           <w:rFonts w:ascii="Courier" w:eastAsia="SF Mono" w:hAnsi="Courier" w:cs="SF Mono"/>
         </w:rPr>
         <w:t>app.js</w:t>
@@ -621,19 +621,19 @@
           <w:color w:val="auto"/>
           <w:sz w:val="21"/>
           <w:szCs w:val="21"/>
-          <w:shd w:val="clear"/>
-          <w:rFonts w:ascii="Segoe UI" w:eastAsia="Segoe WPC" w:hAnsi="Segoe UI" w:cs="Segoe WPC"/>
-        </w:rPr>
-      </w:pPr>
-      <w:r>
-        <w:rPr>
-          <w:spacing w:val="0"/>
-          <w:i w:val="0"/>
-          <w:b w:val="0"/>
-          <w:color w:val="auto"/>
-          <w:sz w:val="21"/>
-          <w:szCs w:val="21"/>
-          <w:shd w:val="clear"/>
+          <w:shd w:val="clear" w:color="auto" w:fill="auto"/>
+          <w:rFonts w:ascii="Segoe UI" w:eastAsia="Segoe WPC" w:hAnsi="Segoe UI" w:cs="Segoe WPC"/>
+        </w:rPr>
+      </w:pPr>
+      <w:r>
+        <w:rPr>
+          <w:spacing w:val="0"/>
+          <w:i w:val="0"/>
+          <w:b w:val="0"/>
+          <w:color w:val="auto"/>
+          <w:sz w:val="21"/>
+          <w:szCs w:val="21"/>
+          <w:shd w:val="clear" w:color="auto" w:fill="auto"/>
           <w:rFonts w:ascii="Segoe UI" w:eastAsia="Segoe WPC" w:hAnsi="Segoe UI" w:cs="Segoe WPC"/>
         </w:rPr>
         <w:t xml:space="preserve">에서 </w:t>
@@ -651,19 +651,19 @@
           <w:color w:val="auto"/>
           <w:sz w:val="21"/>
           <w:szCs w:val="21"/>
-          <w:shd w:val="clear"/>
-          <w:rFonts w:ascii="Courier" w:eastAsia="SF Mono" w:hAnsi="Courier" w:cs="SF Mono"/>
-        </w:rPr>
-      </w:pPr>
-      <w:r>
-        <w:rPr>
-          <w:spacing w:val="0"/>
-          <w:i w:val="0"/>
-          <w:b w:val="0"/>
-          <w:color w:val="auto"/>
-          <w:sz w:val="21"/>
-          <w:szCs w:val="21"/>
-          <w:shd w:val="clear"/>
+          <w:shd w:val="clear" w:color="auto" w:fill="auto"/>
+          <w:rFonts w:ascii="Courier" w:eastAsia="SF Mono" w:hAnsi="Courier" w:cs="SF Mono"/>
+        </w:rPr>
+      </w:pPr>
+      <w:r>
+        <w:rPr>
+          <w:spacing w:val="0"/>
+          <w:i w:val="0"/>
+          <w:b w:val="0"/>
+          <w:color w:val="auto"/>
+          <w:sz w:val="21"/>
+          <w:szCs w:val="21"/>
+          <w:shd w:val="clear" w:color="auto" w:fill="auto"/>
           <w:rFonts w:ascii="Courier" w:eastAsia="SF Mono" w:hAnsi="Courier" w:cs="SF Mono"/>
         </w:rPr>
         <w:t>YOUR_PROJECT_ID</w:t>
@@ -672,7 +672,7 @@
     <w:p>
       <w:pPr>
         <w:jc w:val="left"/>
-        <w:spacing w:lineRule="auto" w:line="390"/>
+        <w:spacing w:lineRule="auto" w:line="391"/>
         <w:ind w:left="0" w:firstLine="0"/>
         <w:rPr>
           <w:spacing w:val="0"/>
@@ -681,19 +681,19 @@
           <w:color w:val="auto"/>
           <w:sz w:val="21"/>
           <w:szCs w:val="21"/>
-          <w:shd w:val="clear"/>
-          <w:rFonts w:ascii="Segoe UI" w:eastAsia="Segoe WPC" w:hAnsi="Segoe UI" w:cs="Segoe WPC"/>
-        </w:rPr>
-      </w:pPr>
-      <w:r>
-        <w:rPr>
-          <w:spacing w:val="0"/>
-          <w:i w:val="0"/>
-          <w:b w:val="0"/>
-          <w:color w:val="auto"/>
-          <w:sz w:val="21"/>
-          <w:szCs w:val="21"/>
-          <w:shd w:val="clear"/>
+          <w:shd w:val="clear" w:color="auto" w:fill="auto"/>
+          <w:rFonts w:ascii="Segoe UI" w:eastAsia="Segoe WPC" w:hAnsi="Segoe UI" w:cs="Segoe WPC"/>
+        </w:rPr>
+      </w:pPr>
+      <w:r>
+        <w:rPr>
+          <w:spacing w:val="0"/>
+          <w:i w:val="0"/>
+          <w:b w:val="0"/>
+          <w:color w:val="auto"/>
+          <w:sz w:val="21"/>
+          <w:szCs w:val="21"/>
+          <w:shd w:val="clear" w:color="auto" w:fill="auto"/>
           <w:rFonts w:ascii="Segoe UI" w:eastAsia="Segoe WPC" w:hAnsi="Segoe UI" w:cs="Segoe WPC"/>
         </w:rPr>
         <w:t xml:space="preserve"> 변경</w:t>
@@ -712,19 +712,19 @@
           <w:color w:val="auto"/>
           <w:sz w:val="21"/>
           <w:szCs w:val="21"/>
-          <w:shd w:val="clear"/>
-          <w:rFonts w:ascii="Courier" w:eastAsia="SF Mono" w:hAnsi="Courier" w:cs="SF Mono"/>
-        </w:rPr>
-      </w:pPr>
-      <w:r>
-        <w:rPr>
-          <w:spacing w:val="0"/>
-          <w:i w:val="0"/>
-          <w:b w:val="0"/>
-          <w:color w:val="auto"/>
-          <w:sz w:val="21"/>
-          <w:szCs w:val="21"/>
-          <w:shd w:val="clear"/>
+          <w:shd w:val="clear" w:color="auto" w:fill="auto"/>
+          <w:rFonts w:ascii="Courier" w:eastAsia="SF Mono" w:hAnsi="Courier" w:cs="SF Mono"/>
+        </w:rPr>
+      </w:pPr>
+      <w:r>
+        <w:rPr>
+          <w:spacing w:val="0"/>
+          <w:i w:val="0"/>
+          <w:b w:val="0"/>
+          <w:color w:val="auto"/>
+          <w:sz w:val="21"/>
+          <w:szCs w:val="21"/>
+          <w:shd w:val="clear" w:color="auto" w:fill="auto"/>
           <w:rFonts w:ascii="Courier" w:eastAsia="SF Mono" w:hAnsi="Courier" w:cs="SF Mono"/>
         </w:rPr>
         <w:t xml:space="preserve">firebase login</w:t>
@@ -733,7 +733,7 @@
     <w:p>
       <w:pPr>
         <w:jc w:val="left"/>
-        <w:spacing w:lineRule="auto" w:line="390"/>
+        <w:spacing w:lineRule="auto" w:line="391"/>
         <w:ind w:left="0" w:firstLine="0"/>
         <w:rPr>
           <w:spacing w:val="0"/>
@@ -742,19 +742,19 @@
           <w:color w:val="auto"/>
           <w:sz w:val="21"/>
           <w:szCs w:val="21"/>
-          <w:shd w:val="clear"/>
-          <w:rFonts w:ascii="Segoe UI" w:eastAsia="Segoe WPC" w:hAnsi="Segoe UI" w:cs="Segoe WPC"/>
-        </w:rPr>
-      </w:pPr>
-      <w:r>
-        <w:rPr>
-          <w:spacing w:val="0"/>
-          <w:i w:val="0"/>
-          <w:b w:val="0"/>
-          <w:color w:val="auto"/>
-          <w:sz w:val="21"/>
-          <w:szCs w:val="21"/>
-          <w:shd w:val="clear"/>
+          <w:shd w:val="clear" w:color="auto" w:fill="auto"/>
+          <w:rFonts w:ascii="Segoe UI" w:eastAsia="Segoe WPC" w:hAnsi="Segoe UI" w:cs="Segoe WPC"/>
+        </w:rPr>
+      </w:pPr>
+      <w:r>
+        <w:rPr>
+          <w:spacing w:val="0"/>
+          <w:i w:val="0"/>
+          <w:b w:val="0"/>
+          <w:color w:val="auto"/>
+          <w:sz w:val="21"/>
+          <w:szCs w:val="21"/>
+          <w:shd w:val="clear" w:color="auto" w:fill="auto"/>
           <w:rFonts w:ascii="Segoe UI" w:eastAsia="Segoe WPC" w:hAnsi="Segoe UI" w:cs="Segoe WPC"/>
         </w:rPr>
         <w:t xml:space="preserve"> 후 </w:t>
@@ -772,19 +772,19 @@
           <w:color w:val="auto"/>
           <w:sz w:val="21"/>
           <w:szCs w:val="21"/>
-          <w:shd w:val="clear"/>
-          <w:rFonts w:ascii="Courier" w:eastAsia="SF Mono" w:hAnsi="Courier" w:cs="SF Mono"/>
-        </w:rPr>
-      </w:pPr>
-      <w:r>
-        <w:rPr>
-          <w:spacing w:val="0"/>
-          <w:i w:val="0"/>
-          <w:b w:val="0"/>
-          <w:color w:val="auto"/>
-          <w:sz w:val="21"/>
-          <w:szCs w:val="21"/>
-          <w:shd w:val="clear"/>
+          <w:shd w:val="clear" w:color="auto" w:fill="auto"/>
+          <w:rFonts w:ascii="Courier" w:eastAsia="SF Mono" w:hAnsi="Courier" w:cs="SF Mono"/>
+        </w:rPr>
+      </w:pPr>
+      <w:r>
+        <w:rPr>
+          <w:spacing w:val="0"/>
+          <w:i w:val="0"/>
+          <w:b w:val="0"/>
+          <w:color w:val="auto"/>
+          <w:sz w:val="21"/>
+          <w:szCs w:val="21"/>
+          <w:shd w:val="clear" w:color="auto" w:fill="auto"/>
           <w:rFonts w:ascii="Courier" w:eastAsia="SF Mono" w:hAnsi="Courier" w:cs="SF Mono"/>
         </w:rPr>
         <w:t xml:space="preserve">cd functions &amp;&amp; npm install</w:t>
@@ -803,19 +803,19 @@
           <w:color w:val="auto"/>
           <w:sz w:val="21"/>
           <w:szCs w:val="21"/>
-          <w:shd w:val="clear"/>
-          <w:rFonts w:ascii="Segoe UI" w:eastAsia="Segoe WPC" w:hAnsi="Segoe UI" w:cs="Segoe WPC"/>
-        </w:rPr>
-      </w:pPr>
-      <w:r>
-        <w:rPr>
-          <w:spacing w:val="0"/>
-          <w:i w:val="0"/>
-          <w:b w:val="0"/>
-          <w:color w:val="auto"/>
-          <w:sz w:val="21"/>
-          <w:szCs w:val="21"/>
-          <w:shd w:val="clear"/>
+          <w:shd w:val="clear" w:color="auto" w:fill="auto"/>
+          <w:rFonts w:ascii="Segoe UI" w:eastAsia="Segoe WPC" w:hAnsi="Segoe UI" w:cs="Segoe WPC"/>
+        </w:rPr>
+      </w:pPr>
+      <w:r>
+        <w:rPr>
+          <w:spacing w:val="0"/>
+          <w:i w:val="0"/>
+          <w:b w:val="0"/>
+          <w:color w:val="auto"/>
+          <w:sz w:val="21"/>
+          <w:szCs w:val="21"/>
+          <w:shd w:val="clear" w:color="auto" w:fill="auto"/>
           <w:rFonts w:ascii="Segoe UI" w:eastAsia="Segoe WPC" w:hAnsi="Segoe UI" w:cs="Segoe WPC"/>
         </w:rPr>
         <w:t xml:space="preserve">환경변수 설정: </w:t>
@@ -833,19 +833,19 @@
           <w:color w:val="auto"/>
           <w:sz w:val="21"/>
           <w:szCs w:val="21"/>
-          <w:shd w:val="clear"/>
-          <w:rFonts w:ascii="Courier" w:eastAsia="SF Mono" w:hAnsi="Courier" w:cs="SF Mono"/>
-        </w:rPr>
-      </w:pPr>
-      <w:r>
-        <w:rPr>
-          <w:spacing w:val="0"/>
-          <w:i w:val="0"/>
-          <w:b w:val="0"/>
-          <w:color w:val="auto"/>
-          <w:sz w:val="21"/>
-          <w:szCs w:val="21"/>
-          <w:shd w:val="clear"/>
+          <w:shd w:val="clear" w:color="auto" w:fill="auto"/>
+          <w:rFonts w:ascii="Courier" w:eastAsia="SF Mono" w:hAnsi="Courier" w:cs="SF Mono"/>
+        </w:rPr>
+      </w:pPr>
+      <w:r>
+        <w:rPr>
+          <w:spacing w:val="0"/>
+          <w:i w:val="0"/>
+          <w:b w:val="0"/>
+          <w:color w:val="auto"/>
+          <w:sz w:val="21"/>
+          <w:szCs w:val="21"/>
+          <w:shd w:val="clear" w:color="auto" w:fill="auto"/>
           <w:rFonts w:ascii="Courier" w:eastAsia="SF Mono" w:hAnsi="Courier" w:cs="SF Mono"/>
         </w:rPr>
         <w:t xml:space="preserve">firebase functions:config:set kiwoom.appkey="키" kiwoom.secretkey="키"</w:t>
@@ -864,19 +864,19 @@
           <w:color w:val="auto"/>
           <w:sz w:val="21"/>
           <w:szCs w:val="21"/>
-          <w:shd w:val="clear"/>
-          <w:rFonts w:ascii="Segoe UI" w:eastAsia="Segoe WPC" w:hAnsi="Segoe UI" w:cs="Segoe WPC"/>
-        </w:rPr>
-      </w:pPr>
-      <w:r>
-        <w:rPr>
-          <w:spacing w:val="0"/>
-          <w:i w:val="0"/>
-          <w:b w:val="0"/>
-          <w:color w:val="auto"/>
-          <w:sz w:val="21"/>
-          <w:szCs w:val="21"/>
-          <w:shd w:val="clear"/>
+          <w:shd w:val="clear" w:color="auto" w:fill="auto"/>
+          <w:rFonts w:ascii="Segoe UI" w:eastAsia="Segoe WPC" w:hAnsi="Segoe UI" w:cs="Segoe WPC"/>
+        </w:rPr>
+      </w:pPr>
+      <w:r>
+        <w:rPr>
+          <w:spacing w:val="0"/>
+          <w:i w:val="0"/>
+          <w:b w:val="0"/>
+          <w:color w:val="auto"/>
+          <w:sz w:val="21"/>
+          <w:szCs w:val="21"/>
+          <w:shd w:val="clear" w:color="auto" w:fill="auto"/>
           <w:rFonts w:ascii="Segoe UI" w:eastAsia="Segoe WPC" w:hAnsi="Segoe UI" w:cs="Segoe WPC"/>
         </w:rPr>
         <w:t xml:space="preserve">배포: </w:t>
@@ -887,26 +887,854 @@
         <w:jc w:val="left"/>
         <w:spacing w:lineRule="auto" w:line="400"/>
         <w:ind w:left="0" w:firstLine="0"/>
+        <w:rPr>
+          <w:spacing w:val="0"/>
+          <w:i w:val="0"/>
+          <w:b w:val="0"/>
+          <w:color w:val="auto"/>
+          <w:sz w:val="21"/>
+          <w:szCs w:val="21"/>
+          <w:shd w:val="clear" w:color="auto" w:fill="auto"/>
+          <w:rFonts w:ascii="Courier" w:eastAsia="SF Mono" w:hAnsi="Courier" w:cs="SF Mono"/>
+          <w:lang w:eastAsia="ko-KR"/>
+        </w:rPr>
+      </w:pPr>
+      <w:r>
+        <w:rPr>
+          <w:spacing w:val="0"/>
+          <w:i w:val="0"/>
+          <w:b w:val="0"/>
+          <w:color w:val="auto"/>
+          <w:sz w:val="21"/>
+          <w:szCs w:val="21"/>
+          <w:shd w:val="clear" w:color="auto" w:fill="auto"/>
+          <w:rFonts w:ascii="Courier" w:eastAsia="SF Mono" w:hAnsi="Courier" w:cs="SF Mono"/>
+        </w:rPr>
+        <w:t xml:space="preserve">firebase deploy</w:t>
+      </w:r>
+    </w:p>
+    <w:p>
+      <w:pPr>
+        <w:jc w:val="left"/>
+        <w:spacing w:lineRule="auto" w:line="400"/>
+        <w:ind w:left="0" w:firstLine="0"/>
+        <w:rPr>
+          <w:spacing w:val="0"/>
+          <w:i w:val="0"/>
+          <w:b w:val="0"/>
+          <w:color w:val="auto"/>
+          <w:sz w:val="21"/>
+          <w:szCs w:val="21"/>
+          <w:shd w:val="clear" w:color="auto" w:fill="auto"/>
+          <w:rFonts w:ascii="Courier" w:eastAsia="SF Mono" w:hAnsi="Courier" w:cs="SF Mono"/>
+          <w:lang w:eastAsia="ko-KR"/>
+        </w:rPr>
+      </w:pPr>
+    </w:p>
+    <w:p>
+      <w:pPr>
+        <w:jc w:val="left"/>
+        <w:spacing w:lineRule="auto" w:line="400"/>
+        <w:ind w:left="0" w:firstLine="0"/>
+        <w:rPr>
+          <w:spacing w:val="0"/>
+          <w:i w:val="0"/>
+          <w:b w:val="0"/>
+          <w:color w:val="auto"/>
+          <w:sz w:val="21"/>
+          <w:szCs w:val="21"/>
+          <w:shd w:val="clear" w:color="auto" w:fill="auto"/>
+          <w:rFonts w:ascii="Courier" w:eastAsia="SF Mono" w:hAnsi="Courier" w:cs="SF Mono"/>
+          <w:lang w:eastAsia="ko-KR"/>
+        </w:rPr>
+      </w:pPr>
+    </w:p>
+    <w:p>
+      <w:pPr>
+        <w:jc w:val="left"/>
+        <w:spacing w:lineRule="auto" w:line="400"/>
+        <w:ind w:left="0" w:firstLine="0"/>
+        <w:rPr>
+          <w:spacing w:val="0"/>
+          <w:i w:val="0"/>
+          <w:b w:val="0"/>
+          <w:color w:val="auto"/>
+          <w:sz w:val="21"/>
+          <w:szCs w:val="21"/>
+          <w:shd w:val="clear" w:color="auto" w:fill="auto"/>
+          <w:rFonts w:ascii="Courier" w:eastAsia="SF Mono" w:hAnsi="Courier" w:cs="SF Mono"/>
+          <w:lang w:eastAsia="ko-KR"/>
+        </w:rPr>
+      </w:pPr>
+    </w:p>
+    <w:p>
+      <w:pPr>
+        <w:jc w:val="left"/>
+        <w:spacing w:lineRule="auto" w:line="373"/>
+        <w:rPr>
+          <w:spacing w:val="0"/>
+          <w:i w:val="0"/>
+          <w:b w:val="0"/>
+          <w:color w:val="auto"/>
+          <w:shd w:val="clear"/>
+          <w:rFonts w:ascii="Segoe UI" w:eastAsia="Segoe WPC" w:hAnsi="Segoe UI" w:cs="Segoe WPC"/>
+        </w:rPr>
+      </w:pPr>
+      <w:r>
+        <w:rPr>
+          <w:spacing w:val="0"/>
+          <w:i w:val="0"/>
+          <w:b w:val="0"/>
+          <w:color w:val="auto"/>
+          <w:shd w:val="clear"/>
+          <w:rFonts w:ascii="Segoe UI" w:eastAsia="Segoe WPC" w:hAnsi="Segoe UI" w:cs="Segoe WPC"/>
+        </w:rPr>
+        <w:t xml:space="preserve">1. 전 세계에 배포하기 (실제 서비스 시작)</w:t>
+      </w:r>
+    </w:p>
+    <w:p>
+      <w:pPr>
+        <w:jc w:val="left"/>
+        <w:shd w:val="clear" w:fill="181818"/>
+        <w:spacing w:lineRule="auto" w:line="360" w:before="0" w:after="0"/>
+        <w:ind w:left="0" w:right="0" w:firstLine="0"/>
+        <w:rPr>
+          <w:spacing w:val="0"/>
+          <w:i w:val="0"/>
+          <w:b w:val="0"/>
+          <w:color w:val="auto"/>
+          <w:shd w:val="clear"/>
+          <w:rFonts w:ascii="Segoe UI" w:eastAsia="Segoe WPC" w:hAnsi="Segoe UI" w:cs="Segoe WPC"/>
+        </w:rPr>
+      </w:pPr>
+      <w:r>
+        <w:rPr>
+          <w:spacing w:val="0"/>
+          <w:i w:val="0"/>
+          <w:b w:val="0"/>
+          <w:color w:val="auto"/>
+          <w:shd w:val="clear"/>
+          <w:rFonts w:ascii="Segoe UI" w:eastAsia="Segoe WPC" w:hAnsi="Segoe UI" w:cs="Segoe WPC"/>
+        </w:rPr>
+        <w:t xml:space="preserve">인터넷 주소를 통해 누구나 접속할 수 있게 하려면 **배포(Deploy)**를 해야 합니다. 터미널에 </w:t>
+      </w:r>
+      <w:r>
+        <w:rPr>
+          <w:spacing w:val="0"/>
+          <w:i w:val="0"/>
+          <w:b w:val="0"/>
+          <w:color w:val="auto"/>
+          <w:shd w:val="clear"/>
+          <w:rFonts w:ascii="Segoe UI" w:eastAsia="Segoe WPC" w:hAnsi="Segoe UI" w:cs="Segoe WPC"/>
+        </w:rPr>
+        <w:t xml:space="preserve">아래 명령어를 입력하세요.</w:t>
+      </w:r>
+    </w:p>
+    <w:p>
+      <w:pPr>
+        <w:jc w:val="left"/>
+        <w:spacing w:lineRule="auto" w:line="400"/>
+        <w:rPr>
+          <w:spacing w:val="0"/>
+          <w:i w:val="0"/>
+          <w:b w:val="0"/>
+          <w:color w:val="auto"/>
+          <w:shd w:val="clear"/>
+          <w:rFonts w:ascii="Segoe UI" w:eastAsia="ui-sans-serif" w:hAnsi="Segoe UI" w:cs="ui-sans-serif"/>
+        </w:rPr>
+      </w:pPr>
+      <w:r>
+        <w:rPr>
+          <w:spacing w:val="0"/>
+          <w:i w:val="0"/>
+          <w:b w:val="0"/>
+          <w:color w:val="auto"/>
+          <w:shd w:val="clear"/>
+          <w:rFonts w:ascii="Segoe UI" w:eastAsia="ui-sans-serif" w:hAnsi="Segoe UI" w:cs="ui-sans-serif"/>
+        </w:rPr>
+        <w:t>bash</w:t>
+      </w:r>
+    </w:p>
+    <w:p>
+      <w:pPr>
+        <w:jc w:val="left"/>
+        <w:spacing w:lineRule="auto" w:line="400"/>
+        <w:rPr>
+          <w:spacing w:val="0"/>
+          <w:i w:val="0"/>
+          <w:b w:val="0"/>
+          <w:color w:val="auto"/>
+          <w:shd w:val="clear"/>
+          <w:rFonts w:ascii="monospace" w:eastAsia="monospace" w:hAnsi="monospace" w:cs="monospace"/>
+        </w:rPr>
+      </w:pPr>
+      <w:r>
+        <w:rPr>
+          <w:spacing w:val="0"/>
+          <w:i w:val="0"/>
+          <w:b w:val="0"/>
+          <w:color w:val="auto"/>
+          <w:shd w:val="clear"/>
+          <w:rFonts w:ascii="monospace" w:eastAsia="monospace" w:hAnsi="monospace" w:cs="monospace"/>
+        </w:rPr>
+        <w:t>firebase</w:t>
+      </w:r>
+      <w:r>
+        <w:rPr>
+          <w:spacing w:val="0"/>
+          <w:i w:val="0"/>
+          <w:b w:val="0"/>
+          <w:color w:val="auto"/>
+          <w:shd w:val="clear"/>
+          <w:rFonts w:ascii="monospace" w:eastAsia="monospace" w:hAnsi="monospace" w:cs="monospace"/>
+        </w:rPr>
+        <w:t xml:space="preserve"> </w:t>
+      </w:r>
+      <w:r>
+        <w:rPr>
+          <w:spacing w:val="0"/>
+          <w:i w:val="0"/>
+          <w:b w:val="0"/>
+          <w:color w:val="auto"/>
+          <w:shd w:val="clear"/>
+          <w:rFonts w:ascii="monospace" w:eastAsia="monospace" w:hAnsi="monospace" w:cs="monospace"/>
+        </w:rPr>
+        <w:t>deploy</w:t>
+      </w:r>
+    </w:p>
+    <w:p>
+      <w:pPr>
+        <w:jc w:val="left"/>
+        <w:spacing w:lineRule="auto" w:line="360" w:before="0" w:after="0"/>
+        <w:ind w:left="0" w:right="0" w:firstLine="0"/>
+        <w:rPr>
+          <w:spacing w:val="0"/>
+          <w:i w:val="1"/>
+          <w:b w:val="0"/>
+          <w:color w:val="auto"/>
+          <w:sz w:val="21"/>
+          <w:szCs w:val="21"/>
+          <w:shd w:val="clear"/>
+          <w:rFonts w:ascii="Segoe UI" w:eastAsia="Segoe WPC" w:hAnsi="Segoe UI" w:cs="Segoe WPC"/>
+        </w:rPr>
+      </w:pPr>
+      <w:r>
+        <w:rPr>
+          <w:spacing w:val="0"/>
+          <w:i w:val="1"/>
+          <w:b w:val="0"/>
+          <w:color w:val="auto"/>
+          <w:sz w:val="21"/>
+          <w:szCs w:val="21"/>
+          <w:shd w:val="clear"/>
+          <w:rFonts w:ascii="Segoe UI" w:eastAsia="Segoe WPC" w:hAnsi="Segoe UI" w:cs="Segoe WPC"/>
+        </w:rPr>
+        <w:t xml:space="preserve">주의: 최초 배포 시에는 시간이 조금 걸릴 수 있습니다. 배포가 성공하면 </w:t>
+      </w:r>
+    </w:p>
+    <w:p>
+      <w:pPr>
+        <w:jc w:val="left"/>
+        <w:spacing w:lineRule="auto" w:line="400"/>
+        <w:rPr>
+          <w:spacing w:val="0"/>
+          <w:i w:val="1"/>
+          <w:b w:val="0"/>
+          <w:color w:val="auto"/>
+          <w:sz w:val="21"/>
+          <w:szCs w:val="21"/>
+          <w:shd w:val="clear"/>
+          <w:rFonts w:ascii="Courier" w:eastAsia="SF Mono" w:hAnsi="Courier" w:cs="SF Mono"/>
+        </w:rPr>
+      </w:pPr>
+      <w:r>
+        <w:rPr>
+          <w:spacing w:val="0"/>
+          <w:i w:val="1"/>
+          <w:b w:val="0"/>
+          <w:color w:val="auto"/>
+          <w:sz w:val="21"/>
+          <w:szCs w:val="21"/>
+          <w:shd w:val="clear"/>
+          <w:rFonts w:ascii="Courier" w:eastAsia="SF Mono" w:hAnsi="Courier" w:cs="SF Mono"/>
+        </w:rPr>
+        <w:t xml:space="preserve">Hosting URL</w:t>
+      </w:r>
+    </w:p>
+    <w:p>
+      <w:pPr>
+        <w:jc w:val="left"/>
+        <w:spacing w:lineRule="auto" w:line="400"/>
+        <w:rPr>
+          <w:spacing w:val="0"/>
+          <w:i w:val="1"/>
+          <w:b w:val="0"/>
+          <w:color w:val="auto"/>
+          <w:sz w:val="21"/>
+          <w:szCs w:val="21"/>
+          <w:shd w:val="clear"/>
+          <w:rFonts w:ascii="Segoe UI" w:eastAsia="Segoe WPC" w:hAnsi="Segoe UI" w:cs="Segoe WPC"/>
+        </w:rPr>
+      </w:pPr>
+      <w:r>
+        <w:rPr>
+          <w:spacing w:val="0"/>
+          <w:i w:val="1"/>
+          <w:b w:val="0"/>
+          <w:color w:val="auto"/>
+          <w:sz w:val="21"/>
+          <w:szCs w:val="21"/>
+          <w:shd w:val="clear"/>
+          <w:rFonts w:ascii="Segoe UI" w:eastAsia="Segoe WPC" w:hAnsi="Segoe UI" w:cs="Segoe WPC"/>
+        </w:rPr>
+        <w:t xml:space="preserve">이라는 주소(예: </w:t>
+      </w:r>
+    </w:p>
+    <w:p>
+      <w:pPr>
+        <w:jc w:val="left"/>
+        <w:spacing w:lineRule="auto" w:line="400"/>
+        <w:rPr>
+          <w:spacing w:val="0"/>
+          <w:i w:val="1"/>
+          <w:b w:val="0"/>
+          <w:color w:val="auto"/>
+          <w:sz w:val="21"/>
+          <w:szCs w:val="21"/>
+          <w:shd w:val="clear"/>
+          <w:rFonts w:ascii="Courier" w:eastAsia="SF Mono" w:hAnsi="Courier" w:cs="SF Mono"/>
+        </w:rPr>
+      </w:pPr>
+      <w:r>
+        <w:rPr>
+          <w:spacing w:val="0"/>
+          <w:i w:val="1"/>
+          <w:b w:val="0"/>
+          <w:color w:val="auto"/>
+          <w:sz w:val="21"/>
+          <w:szCs w:val="21"/>
+          <w:shd w:val="clear"/>
+          <w:rFonts w:ascii="Courier" w:eastAsia="SF Mono" w:hAnsi="Courier" w:cs="SF Mono"/>
+        </w:rPr>
+        <w:t>https://kiwoom-realtimerank.web.app</w:t>
+      </w:r>
+    </w:p>
+    <w:p>
+      <w:pPr>
+        <w:jc w:val="left"/>
+        <w:spacing w:lineRule="auto" w:line="400"/>
+        <w:rPr>
+          <w:spacing w:val="0"/>
+          <w:i w:val="1"/>
+          <w:b w:val="0"/>
+          <w:color w:val="auto"/>
+          <w:sz w:val="21"/>
+          <w:szCs w:val="21"/>
+          <w:shd w:val="clear"/>
+          <w:rFonts w:ascii="Segoe UI" w:eastAsia="Segoe WPC" w:hAnsi="Segoe UI" w:cs="Segoe WPC"/>
+        </w:rPr>
+      </w:pPr>
+      <w:r>
+        <w:rPr>
+          <w:spacing w:val="0"/>
+          <w:i w:val="1"/>
+          <w:b w:val="0"/>
+          <w:color w:val="auto"/>
+          <w:sz w:val="21"/>
+          <w:szCs w:val="21"/>
+          <w:shd w:val="clear"/>
+          <w:rFonts w:ascii="Segoe UI" w:eastAsia="Segoe WPC" w:hAnsi="Segoe UI" w:cs="Segoe WPC"/>
+        </w:rPr>
+        <w:t xml:space="preserve">)가 나옵니다.</w:t>
+      </w:r>
+    </w:p>
+    <w:p>
+      <w:pPr>
+        <w:jc w:val="left"/>
+        <w:spacing w:lineRule="auto" w:line="373"/>
+        <w:rPr>
+          <w:spacing w:val="0"/>
+          <w:i w:val="0"/>
+          <w:b w:val="0"/>
+          <w:color w:val="auto"/>
+          <w:shd w:val="clear"/>
+          <w:rFonts w:ascii="Segoe UI" w:eastAsia="Segoe WPC" w:hAnsi="Segoe UI" w:cs="Segoe WPC"/>
+        </w:rPr>
+      </w:pPr>
+      <w:r>
+        <w:rPr>
+          <w:spacing w:val="0"/>
+          <w:i w:val="0"/>
+          <w:b w:val="0"/>
+          <w:color w:val="auto"/>
+          <w:shd w:val="clear"/>
+          <w:rFonts w:ascii="Segoe UI" w:eastAsia="Segoe WPC" w:hAnsi="Segoe UI" w:cs="Segoe WPC"/>
+        </w:rPr>
+        <w:t xml:space="preserve">2. 내 컴퓨터에서만 테스트하기</w:t>
+      </w:r>
+    </w:p>
+    <w:p>
+      <w:pPr>
+        <w:jc w:val="left"/>
+        <w:shd w:val="clear" w:fill="181818"/>
+        <w:spacing w:lineRule="auto" w:line="360" w:before="0" w:after="0"/>
+        <w:ind w:left="0" w:right="0" w:firstLine="0"/>
+        <w:rPr>
+          <w:spacing w:val="0"/>
+          <w:i w:val="0"/>
+          <w:b w:val="0"/>
+          <w:color w:val="auto"/>
+          <w:shd w:val="clear"/>
+          <w:rFonts w:ascii="Segoe UI" w:eastAsia="Segoe WPC" w:hAnsi="Segoe UI" w:cs="Segoe WPC"/>
+        </w:rPr>
+      </w:pPr>
+      <w:r>
+        <w:rPr>
+          <w:spacing w:val="0"/>
+          <w:i w:val="0"/>
+          <w:b w:val="0"/>
+          <w:color w:val="auto"/>
+          <w:shd w:val="clear"/>
+          <w:rFonts w:ascii="Segoe UI" w:eastAsia="Segoe WPC" w:hAnsi="Segoe UI" w:cs="Segoe WPC"/>
+        </w:rPr>
+        <w:t xml:space="preserve">배포하기 전에 잘 되는지 확인만 하고 싶다면 로컬 서버를 켜면 됩니다.</w:t>
+      </w:r>
+    </w:p>
+    <w:p>
+      <w:pPr>
+        <w:jc w:val="left"/>
+        <w:spacing w:lineRule="auto" w:line="400"/>
+        <w:rPr>
+          <w:spacing w:val="0"/>
+          <w:i w:val="0"/>
+          <w:b w:val="0"/>
+          <w:color w:val="auto"/>
+          <w:shd w:val="clear"/>
+          <w:rFonts w:ascii="Segoe UI" w:eastAsia="ui-sans-serif" w:hAnsi="Segoe UI" w:cs="ui-sans-serif"/>
+        </w:rPr>
+      </w:pPr>
+      <w:r>
+        <w:rPr>
+          <w:spacing w:val="0"/>
+          <w:i w:val="0"/>
+          <w:b w:val="0"/>
+          <w:color w:val="auto"/>
+          <w:shd w:val="clear"/>
+          <w:rFonts w:ascii="Segoe UI" w:eastAsia="ui-sans-serif" w:hAnsi="Segoe UI" w:cs="ui-sans-serif"/>
+        </w:rPr>
+        <w:t>bash</w:t>
+      </w:r>
+    </w:p>
+    <w:p>
+      <w:pPr>
+        <w:jc w:val="left"/>
+        <w:spacing w:lineRule="auto" w:line="400"/>
+        <w:rPr>
+          <w:spacing w:val="0"/>
+          <w:i w:val="0"/>
+          <w:b w:val="0"/>
+          <w:color w:val="auto"/>
+          <w:shd w:val="clear"/>
+          <w:rFonts w:ascii="monospace" w:eastAsia="monospace" w:hAnsi="monospace" w:cs="monospace"/>
+        </w:rPr>
+      </w:pPr>
+      <w:r>
+        <w:rPr>
+          <w:spacing w:val="0"/>
+          <w:i w:val="0"/>
+          <w:b w:val="0"/>
+          <w:color w:val="auto"/>
+          <w:shd w:val="clear"/>
+          <w:rFonts w:ascii="monospace" w:eastAsia="monospace" w:hAnsi="monospace" w:cs="monospace"/>
+        </w:rPr>
+        <w:t xml:space="preserve"># 먼저 functions 폴더의 라이브러리를 설치해야 합니다 (최초 1회)</w:t>
+      </w:r>
+    </w:p>
+    <w:p>
+      <w:pPr>
+        <w:jc w:val="left"/>
+        <w:spacing w:lineRule="auto" w:line="400"/>
+        <w:rPr>
+          <w:spacing w:val="0"/>
+          <w:i w:val="0"/>
+          <w:b w:val="0"/>
+          <w:color w:val="auto"/>
+          <w:shd w:val="clear"/>
+          <w:rFonts w:ascii="monospace" w:eastAsia="monospace" w:hAnsi="monospace" w:cs="monospace"/>
+        </w:rPr>
+      </w:pPr>
+      <w:r>
+        <w:rPr>
+          <w:spacing w:val="0"/>
+          <w:i w:val="0"/>
+          <w:b w:val="0"/>
+          <w:color w:val="auto"/>
+          <w:shd w:val="clear"/>
+          <w:rFonts w:ascii="monospace" w:eastAsia="monospace" w:hAnsi="monospace" w:cs="monospace"/>
+        </w:rPr>
+        <w:t>cd</w:t>
+      </w:r>
+      <w:r>
+        <w:rPr>
+          <w:spacing w:val="0"/>
+          <w:i w:val="0"/>
+          <w:b w:val="0"/>
+          <w:color w:val="auto"/>
+          <w:shd w:val="clear"/>
+          <w:rFonts w:ascii="monospace" w:eastAsia="monospace" w:hAnsi="monospace" w:cs="monospace"/>
+        </w:rPr>
+        <w:t xml:space="preserve"> </w:t>
+      </w:r>
+      <w:r>
+        <w:rPr>
+          <w:spacing w:val="0"/>
+          <w:i w:val="0"/>
+          <w:b w:val="0"/>
+          <w:color w:val="auto"/>
+          <w:shd w:val="clear"/>
+          <w:rFonts w:ascii="monospace" w:eastAsia="monospace" w:hAnsi="monospace" w:cs="monospace"/>
+        </w:rPr>
+        <w:t>functions</w:t>
+      </w:r>
+    </w:p>
+    <w:p>
+      <w:pPr>
+        <w:jc w:val="left"/>
+        <w:spacing w:lineRule="auto" w:line="400"/>
+        <w:rPr>
+          <w:spacing w:val="0"/>
+          <w:i w:val="0"/>
+          <w:b w:val="0"/>
+          <w:color w:val="auto"/>
+          <w:shd w:val="clear"/>
+          <w:rFonts w:ascii="monospace" w:eastAsia="monospace" w:hAnsi="monospace" w:cs="monospace"/>
+        </w:rPr>
+      </w:pPr>
+      <w:r>
+        <w:rPr>
+          <w:spacing w:val="0"/>
+          <w:i w:val="0"/>
+          <w:b w:val="0"/>
+          <w:color w:val="auto"/>
+          <w:shd w:val="clear"/>
+          <w:rFonts w:ascii="monospace" w:eastAsia="monospace" w:hAnsi="monospace" w:cs="monospace"/>
+        </w:rPr>
+        <w:t>npm</w:t>
+      </w:r>
+      <w:r>
+        <w:rPr>
+          <w:spacing w:val="0"/>
+          <w:i w:val="0"/>
+          <w:b w:val="0"/>
+          <w:color w:val="auto"/>
+          <w:shd w:val="clear"/>
+          <w:rFonts w:ascii="monospace" w:eastAsia="monospace" w:hAnsi="monospace" w:cs="monospace"/>
+        </w:rPr>
+        <w:t xml:space="preserve"> </w:t>
+      </w:r>
+      <w:r>
+        <w:rPr>
+          <w:spacing w:val="0"/>
+          <w:i w:val="0"/>
+          <w:b w:val="0"/>
+          <w:color w:val="auto"/>
+          <w:shd w:val="clear"/>
+          <w:rFonts w:ascii="monospace" w:eastAsia="monospace" w:hAnsi="monospace" w:cs="monospace"/>
+        </w:rPr>
+        <w:t>install</w:t>
+      </w:r>
+    </w:p>
+    <w:p>
+      <w:pPr>
+        <w:jc w:val="left"/>
+        <w:spacing w:lineRule="auto" w:line="400"/>
+        <w:rPr>
+          <w:spacing w:val="0"/>
+          <w:i w:val="0"/>
+          <w:b w:val="0"/>
+          <w:color w:val="auto"/>
+          <w:shd w:val="clear"/>
+          <w:rFonts w:ascii="monospace" w:eastAsia="monospace" w:hAnsi="monospace" w:cs="monospace"/>
+        </w:rPr>
+      </w:pPr>
+      <w:r>
+        <w:rPr>
+          <w:spacing w:val="0"/>
+          <w:i w:val="0"/>
+          <w:b w:val="0"/>
+          <w:color w:val="auto"/>
+          <w:shd w:val="clear"/>
+          <w:rFonts w:ascii="monospace" w:eastAsia="monospace" w:hAnsi="monospace" w:cs="monospace"/>
+        </w:rPr>
+        <w:t>cd</w:t>
+      </w:r>
+      <w:r>
+        <w:rPr>
+          <w:spacing w:val="0"/>
+          <w:i w:val="0"/>
+          <w:b w:val="0"/>
+          <w:color w:val="auto"/>
+          <w:shd w:val="clear"/>
+          <w:rFonts w:ascii="monospace" w:eastAsia="monospace" w:hAnsi="monospace" w:cs="monospace"/>
+        </w:rPr>
+        <w:t xml:space="preserve"> </w:t>
+      </w:r>
+      <w:r>
+        <w:rPr>
+          <w:spacing w:val="0"/>
+          <w:i w:val="0"/>
+          <w:b w:val="0"/>
+          <w:color w:val="auto"/>
+          <w:shd w:val="clear"/>
+          <w:rFonts w:ascii="monospace" w:eastAsia="monospace" w:hAnsi="monospace" w:cs="monospace"/>
+        </w:rPr>
+        <w:t>..</w:t>
+      </w:r>
+    </w:p>
+    <w:p>
+      <w:pPr>
+        <w:jc w:val="left"/>
+        <w:spacing w:lineRule="auto" w:line="400"/>
+        <w:rPr>
+          <w:spacing w:val="0"/>
+          <w:i w:val="0"/>
+          <w:b w:val="0"/>
+          <w:color w:val="auto"/>
+          <w:shd w:val="clear"/>
+          <w:rFonts w:ascii="monospace" w:eastAsia="monospace" w:hAnsi="monospace" w:cs="monospace"/>
+        </w:rPr>
+      </w:pPr>
+      <w:r>
+        <w:rPr>
+          <w:spacing w:val="0"/>
+          <w:i w:val="0"/>
+          <w:b w:val="0"/>
+          <w:color w:val="auto"/>
+          <w:shd w:val="clear"/>
+          <w:rFonts w:ascii="monospace" w:eastAsia="monospace" w:hAnsi="monospace" w:cs="monospace"/>
+        </w:rPr>
+        <w:t xml:space="preserve"># 로컬 서버 실행</w:t>
+      </w:r>
+    </w:p>
+    <w:p>
+      <w:pPr>
+        <w:jc w:val="left"/>
+        <w:spacing w:lineRule="auto" w:line="400"/>
+        <w:rPr>
+          <w:spacing w:val="0"/>
+          <w:i w:val="0"/>
+          <w:b w:val="0"/>
+          <w:color w:val="auto"/>
+          <w:shd w:val="clear"/>
+          <w:rFonts w:ascii="monospace" w:eastAsia="monospace" w:hAnsi="monospace" w:cs="monospace"/>
+        </w:rPr>
+      </w:pPr>
+      <w:r>
+        <w:rPr>
+          <w:spacing w:val="0"/>
+          <w:i w:val="0"/>
+          <w:b w:val="0"/>
+          <w:color w:val="auto"/>
+          <w:shd w:val="clear"/>
+          <w:rFonts w:ascii="monospace" w:eastAsia="monospace" w:hAnsi="monospace" w:cs="monospace"/>
+        </w:rPr>
+        <w:t>firebase</w:t>
+      </w:r>
+      <w:r>
+        <w:rPr>
+          <w:spacing w:val="0"/>
+          <w:i w:val="0"/>
+          <w:b w:val="0"/>
+          <w:color w:val="auto"/>
+          <w:shd w:val="clear"/>
+          <w:rFonts w:ascii="monospace" w:eastAsia="monospace" w:hAnsi="monospace" w:cs="monospace"/>
+        </w:rPr>
+        <w:t xml:space="preserve"> </w:t>
+      </w:r>
+      <w:r>
+        <w:rPr>
+          <w:spacing w:val="0"/>
+          <w:i w:val="0"/>
+          <w:b w:val="0"/>
+          <w:color w:val="auto"/>
+          <w:shd w:val="clear"/>
+          <w:rFonts w:ascii="monospace" w:eastAsia="monospace" w:hAnsi="monospace" w:cs="monospace"/>
+        </w:rPr>
+        <w:t>serve</w:t>
+      </w:r>
+    </w:p>
+    <w:p>
+      <w:pPr>
+        <w:jc w:val="left"/>
+        <w:spacing w:lineRule="auto" w:line="360" w:before="0" w:after="0"/>
+        <w:ind w:left="0" w:right="0" w:firstLine="0"/>
+        <w:rPr>
+          <w:spacing w:val="0"/>
+          <w:i w:val="1"/>
+          <w:b w:val="0"/>
+          <w:color w:val="auto"/>
+          <w:sz w:val="21"/>
+          <w:szCs w:val="21"/>
+          <w:shd w:val="clear"/>
+          <w:rFonts w:ascii="Segoe UI" w:eastAsia="Segoe WPC" w:hAnsi="Segoe UI" w:cs="Segoe WPC"/>
+        </w:rPr>
+      </w:pPr>
+      <w:r>
+        <w:rPr>
+          <w:spacing w:val="0"/>
+          <w:i w:val="1"/>
+          <w:b w:val="0"/>
+          <w:color w:val="auto"/>
+          <w:sz w:val="21"/>
+          <w:szCs w:val="21"/>
+          <w:shd w:val="clear"/>
+          <w:rFonts w:ascii="Segoe UI" w:eastAsia="Segoe WPC" w:hAnsi="Segoe UI" w:cs="Segoe WPC"/>
+        </w:rPr>
+        <w:t xml:space="preserve">실행 후 </w:t>
+      </w:r>
+    </w:p>
+    <w:p>
+      <w:pPr>
+        <w:jc w:val="left"/>
+        <w:spacing w:lineRule="auto" w:line="400"/>
+        <w:rPr>
+          <w:spacing w:val="0"/>
+          <w:i w:val="1"/>
+          <w:b w:val="0"/>
+          <w:color w:val="auto"/>
+          <w:sz w:val="21"/>
+          <w:szCs w:val="21"/>
+          <w:shd w:val="clear"/>
+          <w:rFonts w:ascii="Courier" w:eastAsia="SF Mono" w:hAnsi="Courier" w:cs="SF Mono"/>
+        </w:rPr>
+      </w:pPr>
+      <w:r>
+        <w:rPr>
+          <w:spacing w:val="0"/>
+          <w:i w:val="1"/>
+          <w:b w:val="0"/>
+          <w:color w:val="auto"/>
+          <w:sz w:val="21"/>
+          <w:szCs w:val="21"/>
+          <w:shd w:val="clear"/>
+          <w:rFonts w:ascii="Courier" w:eastAsia="SF Mono" w:hAnsi="Courier" w:cs="SF Mono"/>
+        </w:rPr>
+        <w:t>localhost:5000</w:t>
+      </w:r>
+    </w:p>
+    <w:p>
+      <w:pPr>
+        <w:jc w:val="left"/>
+        <w:rPr>
+          <w:spacing w:val="0"/>
+          <w:i w:val="1"/>
+          <w:b w:val="0"/>
+          <w:color w:val="auto"/>
+          <w:sz w:val="21"/>
+          <w:szCs w:val="21"/>
+          <w:shd w:val="clear"/>
+          <w:rFonts w:ascii="Segoe UI" w:eastAsia="Segoe WPC" w:hAnsi="Segoe UI" w:cs="Segoe WPC"/>
+          <w:lang w:eastAsia="ko-KR"/>
+        </w:rPr>
+      </w:pPr>
+      <w:r>
+        <w:rPr>
+          <w:spacing w:val="0"/>
+          <w:i w:val="1"/>
+          <w:b w:val="0"/>
+          <w:color w:val="auto"/>
+          <w:sz w:val="21"/>
+          <w:szCs w:val="21"/>
+          <w:shd w:val="clear"/>
+          <w:rFonts w:ascii="Segoe UI" w:eastAsia="Segoe WPC" w:hAnsi="Segoe UI" w:cs="Segoe WPC"/>
+        </w:rPr>
+        <w:t xml:space="preserve"> 같은 주소로 접속해서 확인할 수 있습니다.</w:t>
+      </w:r>
+    </w:p>
+    <w:p>
+      <w:pPr>
+        <w:jc w:val="left"/>
+        <w:rPr>
+          <w:spacing w:val="0"/>
+          <w:i w:val="1"/>
+          <w:b w:val="0"/>
+          <w:color w:val="auto"/>
+          <w:sz w:val="21"/>
+          <w:szCs w:val="21"/>
+          <w:shd w:val="clear"/>
+          <w:rFonts w:ascii="Segoe UI" w:eastAsia="Segoe WPC" w:hAnsi="Segoe UI" w:cs="Segoe WPC"/>
+          <w:lang w:eastAsia="ko-KR"/>
+        </w:rPr>
+      </w:pPr>
+    </w:p>
+    <w:p>
+      <w:pPr>
+        <w:jc w:val="left"/>
+        <w:rPr>
+          <w:spacing w:val="0"/>
+          <w:i w:val="1"/>
+          <w:b w:val="0"/>
+          <w:color w:val="auto"/>
+          <w:sz w:val="21"/>
+          <w:szCs w:val="21"/>
+          <w:shd w:val="clear"/>
+          <w:rFonts w:ascii="Segoe UI" w:eastAsia="Segoe WPC" w:hAnsi="Segoe UI" w:cs="Segoe WPC"/>
+          <w:lang w:eastAsia="ko-KR"/>
+        </w:rPr>
+      </w:pPr>
+    </w:p>
+    <w:p>
+      <w:pPr>
+        <w:jc w:val="left"/>
         <w:rPr>
           <w:color w:val="auto"/>
           <w:sz w:val="20"/>
           <w:szCs w:val="20"/>
-          <w:shd w:val="clear"/>
+          <w:shd w:val="clear" w:color="auto" w:fill="auto"/>
           <w:rFonts w:ascii="맑은 고딕" w:eastAsia="맑은 고딕" w:hAnsi="맑은 고딕" w:cs="맑은 고딕"/>
         </w:rPr>
       </w:pPr>
       <w:r>
         <w:rPr>
           <w:spacing w:val="0"/>
-          <w:i w:val="0"/>
-          <w:b w:val="0"/>
-          <w:color w:val="auto"/>
-          <w:sz w:val="21"/>
-          <w:szCs w:val="21"/>
-          <w:shd w:val="clear"/>
-          <w:rFonts w:ascii="Courier" w:eastAsia="SF Mono" w:hAnsi="Courier" w:cs="SF Mono"/>
-        </w:rPr>
-        <w:t xml:space="preserve">firebase deploy</w:t>
+          <w:i w:val="1"/>
+          <w:b w:val="0"/>
+          <w:color w:val="auto"/>
+          <w:sz w:val="21"/>
+          <w:szCs w:val="21"/>
+          <w:shd w:val="clear"/>
+          <w:rFonts w:ascii="Segoe UI" w:eastAsia="Segoe WPC" w:hAnsi="Segoe UI" w:cs="Segoe WPC"/>
+          <w:lang w:eastAsia="ko-KR"/>
+        </w:rPr>
+        <w:t xml:space="preserve">firebase functions:config:set </w:t>
+      </w:r>
+      <w:r>
+        <w:rPr>
+          <w:spacing w:val="0"/>
+          <w:i w:val="1"/>
+          <w:b w:val="0"/>
+          <w:color w:val="auto"/>
+          <w:sz w:val="21"/>
+          <w:szCs w:val="21"/>
+          <w:shd w:val="clear"/>
+          <w:rFonts w:ascii="Segoe UI" w:eastAsia="Segoe WPC" w:hAnsi="Segoe UI" w:cs="Segoe WPC"/>
+          <w:lang w:eastAsia="ko-KR"/>
+        </w:rPr>
+        <w:t xml:space="preserve">kiwoom.appkey="W62_plrNeKZvLGo7nJmj03cYnOfBo5oWu6jWhtFyGEU" </w:t>
+      </w:r>
+      <w:r>
+        <w:rPr>
+          <w:spacing w:val="0"/>
+          <w:i w:val="1"/>
+          <w:b w:val="0"/>
+          <w:color w:val="auto"/>
+          <w:sz w:val="21"/>
+          <w:szCs w:val="21"/>
+          <w:shd w:val="clear"/>
+          <w:rFonts w:ascii="Segoe UI" w:eastAsia="Segoe WPC" w:hAnsi="Segoe UI" w:cs="Segoe WPC"/>
+          <w:lang w:eastAsia="ko-KR"/>
+        </w:rPr>
+        <w:t>kiwoom.secretkey="V3Sph2gnN__fIx38wxKl8pSDDLDbfGDBxgsrh-rQKdM"</w:t>
       </w:r>
     </w:p>
     <w:sectPr>
@@ -948,7 +1776,7 @@
         <w:rPr/>
       </w:pPr>
       <w:rPr>
-        <w:shd w:val="clear"/>
+        <w:shd w:val="clear" w:color="auto" w:fill="auto"/>
         <w:rFonts w:ascii="symbol" w:eastAsia="symbol" w:hAnsi="symbol" w:cs="symbol"/>
       </w:rPr>
       <w:lvlText w:val="·"/>
@@ -963,7 +1791,7 @@
         <w:rPr/>
       </w:pPr>
       <w:rPr>
-        <w:shd w:val="clear"/>
+        <w:shd w:val="clear" w:color="auto" w:fill="auto"/>
         <w:rFonts w:ascii="courier new" w:eastAsia="courier new" w:hAnsi="courier new" w:cs="courier new"/>
       </w:rPr>
       <w:lvlText w:val="o"/>
@@ -978,7 +1806,7 @@
         <w:rPr/>
       </w:pPr>
       <w:rPr>
-        <w:shd w:val="clear"/>
+        <w:shd w:val="clear" w:color="auto" w:fill="auto"/>
         <w:rFonts w:ascii="Wingdings" w:eastAsia="Wingdings" w:hAnsi="Wingdings" w:cs="Wingdings"/>
       </w:rPr>
       <w:lvlText w:val="§"/>
@@ -993,7 +1821,7 @@
         <w:rPr/>
       </w:pPr>
       <w:rPr>
-        <w:shd w:val="clear"/>
+        <w:shd w:val="clear" w:color="auto" w:fill="auto"/>
         <w:rFonts w:ascii="Wingdings" w:eastAsia="Wingdings" w:hAnsi="Wingdings" w:cs="Wingdings"/>
       </w:rPr>
       <w:lvlText w:val="§"/>
@@ -1008,7 +1836,7 @@
         <w:rPr/>
       </w:pPr>
       <w:rPr>
-        <w:shd w:val="clear"/>
+        <w:shd w:val="clear" w:color="auto" w:fill="auto"/>
         <w:rFonts w:ascii="Wingdings" w:eastAsia="Wingdings" w:hAnsi="Wingdings" w:cs="Wingdings"/>
       </w:rPr>
       <w:lvlText w:val="§"/>
@@ -1023,7 +1851,7 @@
         <w:rPr/>
       </w:pPr>
       <w:rPr>
-        <w:shd w:val="clear"/>
+        <w:shd w:val="clear" w:color="auto" w:fill="auto"/>
         <w:rFonts w:ascii="Wingdings" w:eastAsia="Wingdings" w:hAnsi="Wingdings" w:cs="Wingdings"/>
       </w:rPr>
       <w:lvlText w:val="§"/>
@@ -1038,7 +1866,7 @@
         <w:rPr/>
       </w:pPr>
       <w:rPr>
-        <w:shd w:val="clear"/>
+        <w:shd w:val="clear" w:color="auto" w:fill="auto"/>
         <w:rFonts w:ascii="Wingdings" w:eastAsia="Wingdings" w:hAnsi="Wingdings" w:cs="Wingdings"/>
       </w:rPr>
       <w:lvlText w:val="§"/>
@@ -1053,7 +1881,7 @@
         <w:rPr/>
       </w:pPr>
       <w:rPr>
-        <w:shd w:val="clear"/>
+        <w:shd w:val="clear" w:color="auto" w:fill="auto"/>
         <w:rFonts w:ascii="Wingdings" w:eastAsia="Wingdings" w:hAnsi="Wingdings" w:cs="Wingdings"/>
       </w:rPr>
       <w:lvlText w:val="§"/>
@@ -1068,7 +1896,7 @@
         <w:rPr/>
       </w:pPr>
       <w:rPr>
-        <w:shd w:val="clear"/>
+        <w:shd w:val="clear" w:color="auto" w:fill="auto"/>
         <w:rFonts w:ascii="Wingdings" w:eastAsia="Wingdings" w:hAnsi="Wingdings" w:cs="Wingdings"/>
       </w:rPr>
       <w:lvlText w:val="§"/>
@@ -1088,7 +1916,7 @@
         <w:rPr/>
       </w:pPr>
       <w:rPr>
-        <w:shd w:val="clear"/>
+        <w:shd w:val="clear" w:color="auto" w:fill="auto"/>
         <w:rFonts w:ascii="symbol" w:eastAsia="symbol" w:hAnsi="symbol" w:cs="symbol"/>
       </w:rPr>
       <w:lvlText w:val="·"/>
@@ -1103,7 +1931,7 @@
         <w:rPr/>
       </w:pPr>
       <w:rPr>
-        <w:shd w:val="clear"/>
+        <w:shd w:val="clear" w:color="auto" w:fill="auto"/>
         <w:rFonts w:ascii="courier new" w:eastAsia="courier new" w:hAnsi="courier new" w:cs="courier new"/>
       </w:rPr>
       <w:lvlText w:val="o"/>
@@ -1118,7 +1946,7 @@
         <w:rPr/>
       </w:pPr>
       <w:rPr>
-        <w:shd w:val="clear"/>
+        <w:shd w:val="clear" w:color="auto" w:fill="auto"/>
         <w:rFonts w:ascii="Wingdings" w:eastAsia="Wingdings" w:hAnsi="Wingdings" w:cs="Wingdings"/>
       </w:rPr>
       <w:lvlText w:val="§"/>
@@ -1133,7 +1961,7 @@
         <w:rPr/>
       </w:pPr>
       <w:rPr>
-        <w:shd w:val="clear"/>
+        <w:shd w:val="clear" w:color="auto" w:fill="auto"/>
         <w:rFonts w:ascii="Wingdings" w:eastAsia="Wingdings" w:hAnsi="Wingdings" w:cs="Wingdings"/>
       </w:rPr>
       <w:lvlText w:val="§"/>
@@ -1148,7 +1976,7 @@
         <w:rPr/>
       </w:pPr>
       <w:rPr>
-        <w:shd w:val="clear"/>
+        <w:shd w:val="clear" w:color="auto" w:fill="auto"/>
         <w:rFonts w:ascii="Wingdings" w:eastAsia="Wingdings" w:hAnsi="Wingdings" w:cs="Wingdings"/>
       </w:rPr>
       <w:lvlText w:val="§"/>
@@ -1163,7 +1991,7 @@
         <w:rPr/>
       </w:pPr>
       <w:rPr>
-        <w:shd w:val="clear"/>
+        <w:shd w:val="clear" w:color="auto" w:fill="auto"/>
         <w:rFonts w:ascii="Wingdings" w:eastAsia="Wingdings" w:hAnsi="Wingdings" w:cs="Wingdings"/>
       </w:rPr>
       <w:lvlText w:val="§"/>
@@ -1178,7 +2006,7 @@
         <w:rPr/>
       </w:pPr>
       <w:rPr>
-        <w:shd w:val="clear"/>
+        <w:shd w:val="clear" w:color="auto" w:fill="auto"/>
         <w:rFonts w:ascii="Wingdings" w:eastAsia="Wingdings" w:hAnsi="Wingdings" w:cs="Wingdings"/>
       </w:rPr>
       <w:lvlText w:val="§"/>
@@ -1193,7 +2021,7 @@
         <w:rPr/>
       </w:pPr>
       <w:rPr>
-        <w:shd w:val="clear"/>
+        <w:shd w:val="clear" w:color="auto" w:fill="auto"/>
         <w:rFonts w:ascii="Wingdings" w:eastAsia="Wingdings" w:hAnsi="Wingdings" w:cs="Wingdings"/>
       </w:rPr>
       <w:lvlText w:val="§"/>
@@ -1208,7 +2036,7 @@
         <w:rPr/>
       </w:pPr>
       <w:rPr>
-        <w:shd w:val="clear"/>
+        <w:shd w:val="clear" w:color="auto" w:fill="auto"/>
         <w:rFonts w:ascii="Wingdings" w:eastAsia="Wingdings" w:hAnsi="Wingdings" w:cs="Wingdings"/>
       </w:rPr>
       <w:lvlText w:val="§"/>
@@ -1228,7 +2056,7 @@
         <w:rPr/>
       </w:pPr>
       <w:rPr>
-        <w:shd w:val="clear"/>
+        <w:shd w:val="clear" w:color="auto" w:fill="auto"/>
       </w:rPr>
       <w:lvlText w:val="%1."/>
     </w:lvl>
@@ -1242,7 +2070,7 @@
         <w:rPr/>
       </w:pPr>
       <w:rPr>
-        <w:shd w:val="clear"/>
+        <w:shd w:val="clear" w:color="auto" w:fill="auto"/>
       </w:rPr>
       <w:lvlText w:val="%2."/>
     </w:lvl>
@@ -1256,7 +2084,7 @@
         <w:rPr/>
       </w:pPr>
       <w:rPr>
-        <w:shd w:val="clear"/>
+        <w:shd w:val="clear" w:color="auto" w:fill="auto"/>
       </w:rPr>
       <w:lvlText w:val="%3."/>
     </w:lvl>
@@ -1270,7 +2098,7 @@
         <w:rPr/>
       </w:pPr>
       <w:rPr>
-        <w:shd w:val="clear"/>
+        <w:shd w:val="clear" w:color="auto" w:fill="auto"/>
       </w:rPr>
       <w:lvlText w:val="%4."/>
     </w:lvl>
@@ -1284,7 +2112,7 @@
         <w:rPr/>
       </w:pPr>
       <w:rPr>
-        <w:shd w:val="clear"/>
+        <w:shd w:val="clear" w:color="auto" w:fill="auto"/>
       </w:rPr>
       <w:lvlText w:val="%5."/>
     </w:lvl>
@@ -1298,7 +2126,7 @@
         <w:rPr/>
       </w:pPr>
       <w:rPr>
-        <w:shd w:val="clear"/>
+        <w:shd w:val="clear" w:color="auto" w:fill="auto"/>
       </w:rPr>
       <w:lvlText w:val="%6."/>
     </w:lvl>
@@ -1312,7 +2140,7 @@
         <w:rPr/>
       </w:pPr>
       <w:rPr>
-        <w:shd w:val="clear"/>
+        <w:shd w:val="clear" w:color="auto" w:fill="auto"/>
       </w:rPr>
       <w:lvlText w:val="%7."/>
     </w:lvl>
@@ -1326,7 +2154,7 @@
         <w:rPr/>
       </w:pPr>
       <w:rPr>
-        <w:shd w:val="clear"/>
+        <w:shd w:val="clear" w:color="auto" w:fill="auto"/>
       </w:rPr>
       <w:lvlText w:val="%8."/>
     </w:lvl>
@@ -1340,7 +2168,7 @@
         <w:rPr/>
       </w:pPr>
       <w:rPr>
-        <w:shd w:val="clear"/>
+        <w:shd w:val="clear" w:color="auto" w:fill="auto"/>
       </w:rPr>
       <w:lvlText w:val="%9."/>
     </w:lvl>
@@ -1359,7 +2187,7 @@
         <w:rPr/>
       </w:pPr>
       <w:rPr>
-        <w:shd w:val="clear"/>
+        <w:shd w:val="clear" w:color="auto" w:fill="auto"/>
       </w:rPr>
       <w:lvlText w:val="%1."/>
     </w:lvl>
@@ -1373,7 +2201,7 @@
         <w:rPr/>
       </w:pPr>
       <w:rPr>
-        <w:shd w:val="clear"/>
+        <w:shd w:val="clear" w:color="auto" w:fill="auto"/>
       </w:rPr>
       <w:lvlText w:val="%2."/>
     </w:lvl>
@@ -1387,7 +2215,7 @@
         <w:rPr/>
       </w:pPr>
       <w:rPr>
-        <w:shd w:val="clear"/>
+        <w:shd w:val="clear" w:color="auto" w:fill="auto"/>
       </w:rPr>
       <w:lvlText w:val="%3."/>
     </w:lvl>
@@ -1401,7 +2229,7 @@
         <w:rPr/>
       </w:pPr>
       <w:rPr>
-        <w:shd w:val="clear"/>
+        <w:shd w:val="clear" w:color="auto" w:fill="auto"/>
       </w:rPr>
       <w:lvlText w:val="%4."/>
     </w:lvl>
@@ -1415,7 +2243,7 @@
         <w:rPr/>
       </w:pPr>
       <w:rPr>
-        <w:shd w:val="clear"/>
+        <w:shd w:val="clear" w:color="auto" w:fill="auto"/>
       </w:rPr>
       <w:lvlText w:val="%5."/>
     </w:lvl>
@@ -1429,7 +2257,7 @@
         <w:rPr/>
       </w:pPr>
       <w:rPr>
-        <w:shd w:val="clear"/>
+        <w:shd w:val="clear" w:color="auto" w:fill="auto"/>
       </w:rPr>
       <w:lvlText w:val="%6."/>
     </w:lvl>
@@ -1443,7 +2271,7 @@
         <w:rPr/>
       </w:pPr>
       <w:rPr>
-        <w:shd w:val="clear"/>
+        <w:shd w:val="clear" w:color="auto" w:fill="auto"/>
       </w:rPr>
       <w:lvlText w:val="%7."/>
     </w:lvl>
@@ -1457,7 +2285,7 @@
         <w:rPr/>
       </w:pPr>
       <w:rPr>
-        <w:shd w:val="clear"/>
+        <w:shd w:val="clear" w:color="auto" w:fill="auto"/>
       </w:rPr>
       <w:lvlText w:val="%8."/>
     </w:lvl>
@@ -1471,7 +2299,7 @@
         <w:rPr/>
       </w:pPr>
       <w:rPr>
-        <w:shd w:val="clear"/>
+        <w:shd w:val="clear" w:color="auto" w:fill="auto"/>
       </w:rPr>
       <w:lvlText w:val="%9."/>
     </w:lvl>
@@ -1500,15 +2328,13 @@
         <w:color w:val="auto"/>
         <w:sz w:val="20"/>
         <w:szCs w:val="20"/>
-        <w:shd w:val="clear"/>
+        <w:shd w:val="clear" w:color="auto" w:fill="auto"/>
       </w:rPr>
     </w:rPrDefault>
   </w:docDefaults>
   <w:style w:default="1" w:styleId="PO1" w:type="paragraph">
     <w:name w:val="Normal"/>
-    <w:next w:val="PO1"/>
     <w:qFormat/>
-    <w:uiPriority w:val="-1"/>
     <w:pPr>
       <w:jc w:val="both"/>
       <w:spacing w:lineRule="auto" w:line="259"/>
@@ -1520,7 +2346,7 @@
     <w:rPr>
       <w:sz w:val="20"/>
       <w:szCs w:val="20"/>
-      <w:shd w:val="clear"/>
+      <w:shd w:val="clear" w:color="auto" w:fill="auto"/>
       <w:rFonts w:ascii="맑은 고딕" w:eastAsia="맑은 고딕" w:hAnsi="맑은 고딕" w:cs="맑은 고딕"/>
     </w:rPr>
   </w:style>
@@ -1528,19 +2354,19 @@
     <w:name w:val="Default Paragraph Font"/>
     <w:next w:val="PO1"/>
     <w:qFormat/>
-    <w:uiPriority w:val="-1"/>
+    <w:uiPriority w:val="1"/>
     <w:semiHidden/>
     <w:unhideWhenUsed/>
     <w:rPr>
       <w:color w:val="auto"/>
       <w:sz w:val="20"/>
       <w:szCs w:val="20"/>
-      <w:shd w:val="clear"/>
+      <w:shd w:val="clear" w:color="auto" w:fill="auto"/>
     </w:rPr>
   </w:style>
   <w:style w:default="1" w:styleId="PO3" w:type="table">
     <w:name w:val="Normal Table"/>
-    <w:uiPriority w:val="-1"/>
+    <w:uiPriority w:val="99"/>
     <w:tblPr>
       <w:tblCellMar>
         <w:bottom w:type="dxa" w:w="0"/>
@@ -1554,7 +2380,7 @@
   <w:style w:default="1" w:styleId="PO4" w:type="numbering">
     <w:name w:val="No List"/>
     <w:next w:val="PO1"/>
-    <w:uiPriority w:val="-1"/>
+    <w:uiPriority w:val="99"/>
     <w:semiHidden/>
     <w:unhideWhenUsed/>
   </w:style>

</xml_diff>